<commit_message>
Update hotel reservation form docx file.
Replace Reservation Form.docx with the latest version for foreigner pre-registration downloads.

Co-authored-by: Cursor <cursoragent@cursor.com>
</commit_message>
<xml_diff>
--- a/files/Reservation Form.docx
+++ b/files/Reservation Form.docx
@@ -1,6 +1,6 @@
 
 <file path=word/document.xml><?xml version="1.0" encoding="utf-8"?>
-<w:document xmlns:wpc="http://schemas.microsoft.com/office/word/2010/wordprocessingCanvas" xmlns:cx="http://schemas.microsoft.com/office/drawing/2014/chartex" xmlns:mc="http://schemas.openxmlformats.org/markup-compatibility/2006" xmlns:o="urn:schemas-microsoft-com:office:office" xmlns:r="http://schemas.openxmlformats.org/officeDocument/2006/relationships" xmlns:m="http://schemas.openxmlformats.org/officeDocument/2006/math" xmlns:v="urn:schemas-microsoft-com:vml" xmlns:wp14="http://schemas.microsoft.com/office/word/2010/wordprocessingDrawing" xmlns:wp="http://schemas.openxmlformats.org/drawingml/2006/wordprocessingDrawing" xmlns:w10="urn:schemas-microsoft-com:office:word" xmlns:w="http://schemas.openxmlformats.org/wordprocessingml/2006/main" xmlns:w14="http://schemas.microsoft.com/office/word/2010/wordml" xmlns:w15="http://schemas.microsoft.com/office/word/2012/wordml" xmlns:w16se="http://schemas.microsoft.com/office/word/2015/wordml/symex" xmlns:wpg="http://schemas.microsoft.com/office/word/2010/wordprocessingGroup" xmlns:wpi="http://schemas.microsoft.com/office/word/2010/wordprocessingInk" xmlns:wne="http://schemas.microsoft.com/office/word/2006/wordml" xmlns:wps="http://schemas.microsoft.com/office/word/2010/wordprocessingShape" mc:Ignorable="w14 w15 w16se wp14">
+<w:document xmlns:wpc="http://schemas.microsoft.com/office/word/2010/wordprocessingCanvas" xmlns:cx="http://schemas.microsoft.com/office/drawing/2014/chartex" xmlns:cx1="http://schemas.microsoft.com/office/drawing/2015/9/8/chartex" xmlns:cx2="http://schemas.microsoft.com/office/drawing/2015/10/21/chartex" xmlns:cx3="http://schemas.microsoft.com/office/drawing/2016/5/9/chartex" xmlns:cx4="http://schemas.microsoft.com/office/drawing/2016/5/10/chartex" xmlns:cx5="http://schemas.microsoft.com/office/drawing/2016/5/11/chartex" xmlns:cx6="http://schemas.microsoft.com/office/drawing/2016/5/12/chartex" xmlns:cx7="http://schemas.microsoft.com/office/drawing/2016/5/13/chartex" xmlns:cx8="http://schemas.microsoft.com/office/drawing/2016/5/14/chartex" xmlns:mc="http://schemas.openxmlformats.org/markup-compatibility/2006" xmlns:aink="http://schemas.microsoft.com/office/drawing/2016/ink" xmlns:am3d="http://schemas.microsoft.com/office/drawing/2017/model3d" xmlns:o="urn:schemas-microsoft-com:office:office" xmlns:r="http://schemas.openxmlformats.org/officeDocument/2006/relationships" xmlns:m="http://schemas.openxmlformats.org/officeDocument/2006/math" xmlns:v="urn:schemas-microsoft-com:vml" xmlns:wp14="http://schemas.microsoft.com/office/word/2010/wordprocessingDrawing" xmlns:wp="http://schemas.openxmlformats.org/drawingml/2006/wordprocessingDrawing" xmlns:w10="urn:schemas-microsoft-com:office:word" xmlns:w="http://schemas.openxmlformats.org/wordprocessingml/2006/main" xmlns:w14="http://schemas.microsoft.com/office/word/2010/wordml" xmlns:w15="http://schemas.microsoft.com/office/word/2012/wordml" xmlns:w16cex="http://schemas.microsoft.com/office/word/2018/wordml/cex" xmlns:w16cid="http://schemas.microsoft.com/office/word/2016/wordml/cid" xmlns:w16="http://schemas.microsoft.com/office/word/2018/wordml" xmlns:w16sdtdh="http://schemas.microsoft.com/office/word/2020/wordml/sdtdatahash" xmlns:w16se="http://schemas.microsoft.com/office/word/2015/wordml/symex" xmlns:wpg="http://schemas.microsoft.com/office/word/2010/wordprocessingGroup" xmlns:wpi="http://schemas.microsoft.com/office/word/2010/wordprocessingInk" xmlns:wne="http://schemas.microsoft.com/office/word/2006/wordml" xmlns:wps="http://schemas.microsoft.com/office/word/2010/wordprocessingShape" mc:Ignorable="w14 w15 w16se w16cid w16 w16cex w16sdtdh wp14">
   <w:body>
     <w:p>
       <w:pPr>
@@ -16,11 +16,12 @@
         <w:rPr>
           <w:rFonts w:ascii="Arial" w:eastAsiaTheme="majorHAnsi" w:hAnsi="Arial" w:cs="Arial"/>
           <w:b/>
+          <w:noProof/>
           <w:sz w:val="28"/>
           <w:u w:val="single"/>
         </w:rPr>
         <w:drawing>
-          <wp:anchor distT="0" distB="0" distL="114300" distR="114300" simplePos="0" relativeHeight="251658240" behindDoc="0" locked="0" layoutInCell="1" allowOverlap="1">
+          <wp:anchor distT="0" distB="0" distL="114300" distR="114300" simplePos="0" relativeHeight="251658240" behindDoc="0" locked="0" layoutInCell="1" allowOverlap="1" wp14:anchorId="094516A8" wp14:editId="3A82E1CE">
             <wp:simplePos x="0" y="0"/>
             <wp:positionH relativeFrom="margin">
               <wp:align>center</wp:align>
@@ -113,18 +114,7 @@
           <w:sz w:val="28"/>
           <w:u w:val="single"/>
         </w:rPr>
-        <w:t xml:space="preserve">EL </w:t>
-      </w:r>
-      <w:bookmarkStart w:id="0" w:name="_GoBack"/>
-      <w:bookmarkEnd w:id="0"/>
-      <w:r>
-        <w:rPr>
-          <w:rFonts w:ascii="Arial" w:eastAsiaTheme="majorHAnsi" w:hAnsi="Arial" w:cs="Arial"/>
-          <w:b/>
-          <w:sz w:val="28"/>
-          <w:u w:val="single"/>
-        </w:rPr>
-        <w:t>RESERVATION REQUEST</w:t>
+        <w:t>EL RESERVATION REQUEST</w:t>
       </w:r>
       <w:r>
         <w:rPr>
@@ -133,27 +123,7 @@
           <w:sz w:val="28"/>
           <w:u w:val="single"/>
         </w:rPr>
-        <w:t xml:space="preserve"> </w:t>
-      </w:r>
-      <w:proofErr w:type="gramStart"/>
-      <w:r>
-        <w:rPr>
-          <w:rFonts w:ascii="Arial" w:eastAsiaTheme="majorHAnsi" w:hAnsi="Arial" w:cs="Arial"/>
-          <w:b/>
-          <w:sz w:val="28"/>
-          <w:u w:val="single"/>
-        </w:rPr>
-        <w:t>For</w:t>
-      </w:r>
-      <w:proofErr w:type="gramEnd"/>
-      <w:r>
-        <w:rPr>
-          <w:rFonts w:ascii="Arial" w:eastAsiaTheme="majorHAnsi" w:hAnsi="Arial" w:cs="Arial"/>
-          <w:b/>
-          <w:sz w:val="28"/>
-          <w:u w:val="single"/>
-        </w:rPr>
-        <w:t xml:space="preserve"> 2026 </w:t>
+        <w:t xml:space="preserve"> For 2026 </w:t>
       </w:r>
       <w:r>
         <w:rPr>
@@ -178,7 +148,7 @@
       <w:pPr>
         <w:jc w:val="center"/>
         <w:rPr>
-          <w:rFonts w:ascii="Arial" w:eastAsiaTheme="majorHAnsi" w:hAnsi="Arial" w:cs="Arial" w:hint="eastAsia"/>
+          <w:rFonts w:ascii="Arial" w:eastAsiaTheme="majorHAnsi" w:hAnsi="Arial" w:cs="Arial"/>
           <w:b/>
           <w:sz w:val="28"/>
           <w:u w:val="single"/>
@@ -227,85 +197,14 @@
         <w:rPr>
           <w:rFonts w:ascii="Arial" w:eastAsia="맑은 고딕" w:hAnsi="Arial" w:cs="Arial"/>
         </w:rPr>
-        <w:t>Please fill reservation form and return directly by E</w:t>
-      </w:r>
-      <w:r>
-        <w:rPr>
-          <w:rFonts w:ascii="Arial" w:eastAsia="맑은 고딕" w:hAnsi="Arial" w:cs="Arial"/>
-        </w:rPr>
-        <w:t xml:space="preserve">-mail to </w:t>
+        <w:t xml:space="preserve">Please complete the reservation form </w:t>
       </w:r>
       <w:r>
         <w:rPr>
           <w:rFonts w:ascii="Arial" w:eastAsia="맑은 고딕" w:hAnsi="Arial" w:cs="Arial"/>
           <w:u w:val="single"/>
         </w:rPr>
-        <w:t>by</w:t>
-      </w:r>
-      <w:r>
-        <w:rPr>
-          <w:rFonts w:ascii="Arial" w:eastAsia="맑은 고딕" w:hAnsi="Arial" w:cs="Arial"/>
-          <w:u w:val="single"/>
-        </w:rPr>
-        <w:t xml:space="preserve"> </w:t>
-      </w:r>
-      <w:r>
-        <w:rPr>
-          <w:rFonts w:ascii="Arial" w:eastAsia="맑은 고딕" w:hAnsi="Arial" w:cs="Arial"/>
-          <w:u w:val="single"/>
-        </w:rPr>
-        <w:t>28</w:t>
-      </w:r>
-      <w:r>
-        <w:rPr>
-          <w:rFonts w:ascii="Arial" w:eastAsia="맑은 고딕" w:hAnsi="Arial" w:cs="Arial" w:hint="eastAsia"/>
-          <w:u w:val="single"/>
-          <w:vertAlign w:val="superscript"/>
-        </w:rPr>
-        <w:t>t</w:t>
-      </w:r>
-      <w:r>
-        <w:rPr>
-          <w:rFonts w:ascii="Arial" w:eastAsia="맑은 고딕" w:hAnsi="Arial" w:cs="Arial"/>
-          <w:u w:val="single"/>
-          <w:vertAlign w:val="superscript"/>
-        </w:rPr>
-        <w:t>h</w:t>
-      </w:r>
-      <w:r>
-        <w:rPr>
-          <w:rFonts w:ascii="Arial" w:eastAsia="맑은 고딕" w:hAnsi="Arial" w:cs="Arial"/>
-          <w:u w:val="single"/>
-        </w:rPr>
-        <w:t xml:space="preserve"> Sep</w:t>
-      </w:r>
-      <w:r>
-        <w:rPr>
-          <w:rFonts w:ascii="Arial" w:eastAsia="맑은 고딕" w:hAnsi="Arial" w:cs="Arial"/>
-          <w:u w:val="single"/>
-        </w:rPr>
-        <w:t xml:space="preserve"> </w:t>
-      </w:r>
-      <w:r>
-        <w:rPr>
-          <w:rFonts w:ascii="Arial" w:eastAsia="맑은 고딕" w:hAnsi="Arial" w:cs="Arial"/>
-          <w:u w:val="single"/>
-        </w:rPr>
-        <w:t>,</w:t>
-      </w:r>
-      <w:r>
-        <w:rPr>
-          <w:rFonts w:ascii="Arial" w:eastAsia="맑은 고딕" w:hAnsi="Arial" w:cs="Arial"/>
-          <w:u w:val="single"/>
-        </w:rPr>
-        <w:t>2026</w:t>
-      </w:r>
-      <w:r>
-        <w:rPr>
-          <w:rFonts w:ascii="Arial" w:eastAsia="맑은 고딕" w:hAnsi="Arial" w:cs="Arial"/>
-          <w:u w:val="single"/>
-        </w:rPr>
-        <w:t xml:space="preserve"> to ensure room availability and rate.</w:t>
+        <w:t>by September 14, 2026, to secure the special room rate and room availability.</w:t>
       </w:r>
     </w:p>
     <w:p>
@@ -333,14 +232,35 @@
           <w:rFonts w:ascii="Arial" w:hAnsi="Arial" w:cs="Arial"/>
           <w:sz w:val="18"/>
         </w:rPr>
-        <w:t>Reservations received after September 28, 2026, may be subject to revised room rates, and room availability cannot be guaranteed</w:t>
+        <w:t xml:space="preserve">Reservations received after September </w:t>
+      </w:r>
+      <w:r>
+        <w:rPr>
+          <w:rFonts w:ascii="Arial" w:hAnsi="Arial" w:cs="Arial"/>
+          <w:sz w:val="18"/>
+        </w:rPr>
+        <w:t>14</w:t>
+      </w:r>
+      <w:r>
+        <w:rPr>
+          <w:rFonts w:ascii="Arial" w:hAnsi="Arial" w:cs="Arial"/>
+          <w:sz w:val="18"/>
+        </w:rPr>
+        <w:t>, 2026, may be subject to revised room rates, and room availability cannot be guaranteed</w:t>
+      </w:r>
+      <w:r>
+        <w:rPr>
+          <w:rFonts w:ascii="Arial" w:hAnsi="Arial" w:cs="Arial"/>
+          <w:sz w:val="18"/>
+        </w:rPr>
+        <w:t>.</w:t>
       </w:r>
     </w:p>
     <w:p>
       <w:pPr>
         <w:spacing w:line="300" w:lineRule="exact"/>
         <w:rPr>
-          <w:rFonts w:ascii="Arial" w:hAnsi="Arial" w:cs="Arial" w:hint="eastAsia"/>
+          <w:rFonts w:ascii="Arial" w:hAnsi="Arial" w:cs="Arial"/>
           <w:b/>
           <w:sz w:val="18"/>
           <w:szCs w:val="20"/>
@@ -367,32 +287,8 @@
           <w:sz w:val="18"/>
           <w:szCs w:val="20"/>
         </w:rPr>
-        <w:t xml:space="preserve">Please fill out this form and send this reservation form to </w:t>
+        <w:t>Please upload the completed reservation form to the online registration page.</w:t>
       </w:r>
-      <w:hyperlink r:id="rId9" w:history="1">
-        <w:r>
-          <w:rPr>
-            <w:rStyle w:val="a6"/>
-            <w:rFonts w:ascii="Arial" w:eastAsia="맑은 고딕" w:hAnsi="Arial" w:cs="Arial"/>
-            <w:b/>
-            <w:color w:val="auto"/>
-            <w:sz w:val="18"/>
-            <w:szCs w:val="20"/>
-          </w:rPr>
-          <w:t>rsvn.coexcenter</w:t>
-        </w:r>
-        <w:r>
-          <w:rPr>
-            <w:rStyle w:val="a6"/>
-            <w:rFonts w:ascii="Arial" w:hAnsi="Arial" w:cs="Arial"/>
-            <w:b/>
-            <w:color w:val="auto"/>
-            <w:sz w:val="18"/>
-            <w:szCs w:val="20"/>
-          </w:rPr>
-          <w:t>@glad-hotels.com</w:t>
-        </w:r>
-      </w:hyperlink>
     </w:p>
     <w:tbl>
       <w:tblPr>
@@ -1679,9 +1575,8 @@
                 <w:sz w:val="18"/>
                 <w:szCs w:val="17"/>
               </w:rPr>
-              <w:t xml:space="preserve"> For 2 </w:t>
-            </w:r>
-            <w:proofErr w:type="spellStart"/>
+              <w:t xml:space="preserve"> For 2 pe</w:t>
+            </w:r>
             <w:r>
               <w:rPr>
                 <w:rFonts w:ascii="Arial" w:eastAsia="맑은 고딕" w:hAnsi="Arial" w:cs="Arial"/>
@@ -1689,7 +1584,7 @@
                 <w:sz w:val="18"/>
                 <w:szCs w:val="17"/>
               </w:rPr>
-              <w:t>peson</w:t>
+              <w:t>r</w:t>
             </w:r>
             <w:r>
               <w:rPr>
@@ -1698,9 +1593,17 @@
                 <w:sz w:val="18"/>
                 <w:szCs w:val="17"/>
               </w:rPr>
+              <w:t>son</w:t>
+            </w:r>
+            <w:r>
+              <w:rPr>
+                <w:rFonts w:ascii="Arial" w:eastAsia="맑은 고딕" w:hAnsi="Arial" w:cs="Arial"/>
+                <w:color w:val="000000" w:themeColor="text1"/>
+                <w:sz w:val="18"/>
+                <w:szCs w:val="17"/>
+              </w:rPr>
               <w:t>s</w:t>
             </w:r>
-            <w:proofErr w:type="spellEnd"/>
           </w:p>
         </w:tc>
       </w:tr>
@@ -2226,7 +2129,7 @@
             <w:pPr>
               <w:spacing w:line="300" w:lineRule="exact"/>
               <w:rPr>
-                <w:rFonts w:ascii="Arial" w:eastAsia="맑은 고딕" w:hAnsi="Arial" w:cs="Arial" w:hint="eastAsia"/>
+                <w:rFonts w:ascii="Arial" w:eastAsia="맑은 고딕" w:hAnsi="Arial" w:cs="Arial"/>
                 <w:b/>
                 <w:sz w:val="18"/>
               </w:rPr>
@@ -3337,20 +3240,8 @@
                 <w:sz w:val="16"/>
                 <w:szCs w:val="18"/>
               </w:rPr>
-              <w:t xml:space="preserve">Reservation </w:t>
-            </w:r>
-            <w:proofErr w:type="spellStart"/>
-            <w:r>
-              <w:rPr>
-                <w:rFonts w:ascii="Arial" w:hAnsi="Arial" w:cs="Arial"/>
-                <w:b/>
-                <w:color w:val="000000" w:themeColor="text1"/>
-                <w:sz w:val="16"/>
-                <w:szCs w:val="18"/>
-              </w:rPr>
-              <w:t>Dept</w:t>
-            </w:r>
-            <w:proofErr w:type="spellEnd"/>
+              <w:t>Reservation Dept</w:t>
+            </w:r>
           </w:p>
         </w:tc>
         <w:tc>
@@ -3371,7 +3262,7 @@
                 <w:szCs w:val="18"/>
               </w:rPr>
             </w:pPr>
-            <w:hyperlink r:id="rId10" w:history="1">
+            <w:hyperlink r:id="rId9" w:history="1">
               <w:r>
                 <w:rPr>
                   <w:rStyle w:val="a6"/>
@@ -3499,7 +3390,7 @@
                 <w:szCs w:val="18"/>
               </w:rPr>
             </w:pPr>
-            <w:hyperlink r:id="rId11" w:history="1">
+            <w:hyperlink r:id="rId10" w:history="1">
               <w:r>
                 <w:rPr>
                   <w:rStyle w:val="a6"/>
@@ -3672,7 +3563,7 @@
                 <w:szCs w:val="18"/>
               </w:rPr>
             </w:pPr>
-            <w:hyperlink r:id="rId12" w:history="1">
+            <w:hyperlink r:id="rId11" w:history="1">
               <w:r>
                 <w:rPr>
                   <w:rStyle w:val="a6"/>
@@ -3697,7 +3588,7 @@
       </w:pPr>
     </w:p>
     <w:sectPr>
-      <w:footerReference w:type="default" r:id="rId13"/>
+      <w:footerReference w:type="default" r:id="rId12"/>
       <w:pgSz w:w="11906" w:h="16838"/>
       <w:pgMar w:top="720" w:right="720" w:bottom="720" w:left="720" w:header="851" w:footer="992" w:gutter="0"/>
       <w:cols w:space="425"/>
@@ -3708,7 +3599,7 @@
 </file>
 
 <file path=word/endnotes.xml><?xml version="1.0" encoding="utf-8"?>
-<w:endnotes xmlns:wpc="http://schemas.microsoft.com/office/word/2010/wordprocessingCanvas" xmlns:cx="http://schemas.microsoft.com/office/drawing/2014/chartex" xmlns:mc="http://schemas.openxmlformats.org/markup-compatibility/2006" xmlns:o="urn:schemas-microsoft-com:office:office" xmlns:r="http://schemas.openxmlformats.org/officeDocument/2006/relationships" xmlns:m="http://schemas.openxmlformats.org/officeDocument/2006/math" xmlns:v="urn:schemas-microsoft-com:vml" xmlns:wp14="http://schemas.microsoft.com/office/word/2010/wordprocessingDrawing" xmlns:wp="http://schemas.openxmlformats.org/drawingml/2006/wordprocessingDrawing" xmlns:w10="urn:schemas-microsoft-com:office:word" xmlns:w="http://schemas.openxmlformats.org/wordprocessingml/2006/main" xmlns:w14="http://schemas.microsoft.com/office/word/2010/wordml" xmlns:w15="http://schemas.microsoft.com/office/word/2012/wordml" xmlns:w16se="http://schemas.microsoft.com/office/word/2015/wordml/symex" xmlns:wpg="http://schemas.microsoft.com/office/word/2010/wordprocessingGroup" xmlns:wpi="http://schemas.microsoft.com/office/word/2010/wordprocessingInk" xmlns:wne="http://schemas.microsoft.com/office/word/2006/wordml" xmlns:wps="http://schemas.microsoft.com/office/word/2010/wordprocessingShape" mc:Ignorable="w14 w15 w16se wp14">
+<w:endnotes xmlns:wpc="http://schemas.microsoft.com/office/word/2010/wordprocessingCanvas" xmlns:cx="http://schemas.microsoft.com/office/drawing/2014/chartex" xmlns:cx1="http://schemas.microsoft.com/office/drawing/2015/9/8/chartex" xmlns:cx2="http://schemas.microsoft.com/office/drawing/2015/10/21/chartex" xmlns:cx3="http://schemas.microsoft.com/office/drawing/2016/5/9/chartex" xmlns:cx4="http://schemas.microsoft.com/office/drawing/2016/5/10/chartex" xmlns:cx5="http://schemas.microsoft.com/office/drawing/2016/5/11/chartex" xmlns:cx6="http://schemas.microsoft.com/office/drawing/2016/5/12/chartex" xmlns:cx7="http://schemas.microsoft.com/office/drawing/2016/5/13/chartex" xmlns:cx8="http://schemas.microsoft.com/office/drawing/2016/5/14/chartex" xmlns:mc="http://schemas.openxmlformats.org/markup-compatibility/2006" xmlns:aink="http://schemas.microsoft.com/office/drawing/2016/ink" xmlns:am3d="http://schemas.microsoft.com/office/drawing/2017/model3d" xmlns:o="urn:schemas-microsoft-com:office:office" xmlns:r="http://schemas.openxmlformats.org/officeDocument/2006/relationships" xmlns:m="http://schemas.openxmlformats.org/officeDocument/2006/math" xmlns:v="urn:schemas-microsoft-com:vml" xmlns:wp14="http://schemas.microsoft.com/office/word/2010/wordprocessingDrawing" xmlns:wp="http://schemas.openxmlformats.org/drawingml/2006/wordprocessingDrawing" xmlns:w10="urn:schemas-microsoft-com:office:word" xmlns:w="http://schemas.openxmlformats.org/wordprocessingml/2006/main" xmlns:w14="http://schemas.microsoft.com/office/word/2010/wordml" xmlns:w15="http://schemas.microsoft.com/office/word/2012/wordml" xmlns:w16cex="http://schemas.microsoft.com/office/word/2018/wordml/cex" xmlns:w16cid="http://schemas.microsoft.com/office/word/2016/wordml/cid" xmlns:w16="http://schemas.microsoft.com/office/word/2018/wordml" xmlns:w16sdtdh="http://schemas.microsoft.com/office/word/2020/wordml/sdtdatahash" xmlns:w16se="http://schemas.microsoft.com/office/word/2015/wordml/symex" xmlns:wpg="http://schemas.microsoft.com/office/word/2010/wordprocessingGroup" xmlns:wpi="http://schemas.microsoft.com/office/word/2010/wordprocessingInk" xmlns:wne="http://schemas.microsoft.com/office/word/2006/wordml" xmlns:wps="http://schemas.microsoft.com/office/word/2010/wordprocessingShape" mc:Ignorable="w14 w15 w16se w16cid w16 w16cex w16sdtdh wp14">
   <w:endnote w:type="separator" w:id="-1">
     <w:p>
       <w:r>
@@ -3727,7 +3618,7 @@
 </file>
 
 <file path=word/footer1.xml><?xml version="1.0" encoding="utf-8"?>
-<w:ftr xmlns:wpc="http://schemas.microsoft.com/office/word/2010/wordprocessingCanvas" xmlns:cx="http://schemas.microsoft.com/office/drawing/2014/chartex" xmlns:mc="http://schemas.openxmlformats.org/markup-compatibility/2006" xmlns:o="urn:schemas-microsoft-com:office:office" xmlns:r="http://schemas.openxmlformats.org/officeDocument/2006/relationships" xmlns:m="http://schemas.openxmlformats.org/officeDocument/2006/math" xmlns:v="urn:schemas-microsoft-com:vml" xmlns:wp14="http://schemas.microsoft.com/office/word/2010/wordprocessingDrawing" xmlns:wp="http://schemas.openxmlformats.org/drawingml/2006/wordprocessingDrawing" xmlns:w10="urn:schemas-microsoft-com:office:word" xmlns:w="http://schemas.openxmlformats.org/wordprocessingml/2006/main" xmlns:w14="http://schemas.microsoft.com/office/word/2010/wordml" xmlns:w15="http://schemas.microsoft.com/office/word/2012/wordml" xmlns:w16se="http://schemas.microsoft.com/office/word/2015/wordml/symex" xmlns:wpg="http://schemas.microsoft.com/office/word/2010/wordprocessingGroup" xmlns:wpi="http://schemas.microsoft.com/office/word/2010/wordprocessingInk" xmlns:wne="http://schemas.microsoft.com/office/word/2006/wordml" xmlns:wps="http://schemas.microsoft.com/office/word/2010/wordprocessingShape" mc:Ignorable="w14 w15 w16se wp14">
+<w:ftr xmlns:wpc="http://schemas.microsoft.com/office/word/2010/wordprocessingCanvas" xmlns:cx="http://schemas.microsoft.com/office/drawing/2014/chartex" xmlns:cx1="http://schemas.microsoft.com/office/drawing/2015/9/8/chartex" xmlns:cx2="http://schemas.microsoft.com/office/drawing/2015/10/21/chartex" xmlns:cx3="http://schemas.microsoft.com/office/drawing/2016/5/9/chartex" xmlns:cx4="http://schemas.microsoft.com/office/drawing/2016/5/10/chartex" xmlns:cx5="http://schemas.microsoft.com/office/drawing/2016/5/11/chartex" xmlns:cx6="http://schemas.microsoft.com/office/drawing/2016/5/12/chartex" xmlns:cx7="http://schemas.microsoft.com/office/drawing/2016/5/13/chartex" xmlns:cx8="http://schemas.microsoft.com/office/drawing/2016/5/14/chartex" xmlns:mc="http://schemas.openxmlformats.org/markup-compatibility/2006" xmlns:aink="http://schemas.microsoft.com/office/drawing/2016/ink" xmlns:am3d="http://schemas.microsoft.com/office/drawing/2017/model3d" xmlns:o="urn:schemas-microsoft-com:office:office" xmlns:r="http://schemas.openxmlformats.org/officeDocument/2006/relationships" xmlns:m="http://schemas.openxmlformats.org/officeDocument/2006/math" xmlns:v="urn:schemas-microsoft-com:vml" xmlns:wp14="http://schemas.microsoft.com/office/word/2010/wordprocessingDrawing" xmlns:wp="http://schemas.openxmlformats.org/drawingml/2006/wordprocessingDrawing" xmlns:w10="urn:schemas-microsoft-com:office:word" xmlns:w="http://schemas.openxmlformats.org/wordprocessingml/2006/main" xmlns:w14="http://schemas.microsoft.com/office/word/2010/wordml" xmlns:w15="http://schemas.microsoft.com/office/word/2012/wordml" xmlns:w16cex="http://schemas.microsoft.com/office/word/2018/wordml/cex" xmlns:w16cid="http://schemas.microsoft.com/office/word/2016/wordml/cid" xmlns:w16="http://schemas.microsoft.com/office/word/2018/wordml" xmlns:w16sdtdh="http://schemas.microsoft.com/office/word/2020/wordml/sdtdatahash" xmlns:w16se="http://schemas.microsoft.com/office/word/2015/wordml/symex" xmlns:wpg="http://schemas.microsoft.com/office/word/2010/wordprocessingGroup" xmlns:wpi="http://schemas.microsoft.com/office/word/2010/wordprocessingInk" xmlns:wne="http://schemas.microsoft.com/office/word/2006/wordml" xmlns:wps="http://schemas.microsoft.com/office/word/2010/wordprocessingShape" mc:Ignorable="w14 w15 w16se w16cid w16 w16cex w16sdtdh wp14">
   <w:p>
     <w:pPr>
       <w:pStyle w:val="a5"/>
@@ -3742,7 +3633,7 @@
         <w:noProof/>
       </w:rPr>
       <w:drawing>
-        <wp:anchor distT="0" distB="0" distL="114300" distR="114300" simplePos="0" relativeHeight="251660288" behindDoc="0" locked="0" layoutInCell="1" allowOverlap="1" wp14:anchorId="109DDC66" wp14:editId="131CFF03">
+        <wp:anchor distT="0" distB="0" distL="114300" distR="114300" simplePos="0" relativeHeight="251660288" behindDoc="0" locked="0" layoutInCell="1" allowOverlap="1" wp14:anchorId="65250B4C" wp14:editId="592F56D2">
           <wp:simplePos x="0" y="0"/>
           <wp:positionH relativeFrom="margin">
             <wp:align>center</wp:align>
@@ -3806,7 +3697,7 @@
 </file>
 
 <file path=word/footnotes.xml><?xml version="1.0" encoding="utf-8"?>
-<w:footnotes xmlns:wpc="http://schemas.microsoft.com/office/word/2010/wordprocessingCanvas" xmlns:cx="http://schemas.microsoft.com/office/drawing/2014/chartex" xmlns:mc="http://schemas.openxmlformats.org/markup-compatibility/2006" xmlns:o="urn:schemas-microsoft-com:office:office" xmlns:r="http://schemas.openxmlformats.org/officeDocument/2006/relationships" xmlns:m="http://schemas.openxmlformats.org/officeDocument/2006/math" xmlns:v="urn:schemas-microsoft-com:vml" xmlns:wp14="http://schemas.microsoft.com/office/word/2010/wordprocessingDrawing" xmlns:wp="http://schemas.openxmlformats.org/drawingml/2006/wordprocessingDrawing" xmlns:w10="urn:schemas-microsoft-com:office:word" xmlns:w="http://schemas.openxmlformats.org/wordprocessingml/2006/main" xmlns:w14="http://schemas.microsoft.com/office/word/2010/wordml" xmlns:w15="http://schemas.microsoft.com/office/word/2012/wordml" xmlns:w16se="http://schemas.microsoft.com/office/word/2015/wordml/symex" xmlns:wpg="http://schemas.microsoft.com/office/word/2010/wordprocessingGroup" xmlns:wpi="http://schemas.microsoft.com/office/word/2010/wordprocessingInk" xmlns:wne="http://schemas.microsoft.com/office/word/2006/wordml" xmlns:wps="http://schemas.microsoft.com/office/word/2010/wordprocessingShape" mc:Ignorable="w14 w15 w16se wp14">
+<w:footnotes xmlns:wpc="http://schemas.microsoft.com/office/word/2010/wordprocessingCanvas" xmlns:cx="http://schemas.microsoft.com/office/drawing/2014/chartex" xmlns:cx1="http://schemas.microsoft.com/office/drawing/2015/9/8/chartex" xmlns:cx2="http://schemas.microsoft.com/office/drawing/2015/10/21/chartex" xmlns:cx3="http://schemas.microsoft.com/office/drawing/2016/5/9/chartex" xmlns:cx4="http://schemas.microsoft.com/office/drawing/2016/5/10/chartex" xmlns:cx5="http://schemas.microsoft.com/office/drawing/2016/5/11/chartex" xmlns:cx6="http://schemas.microsoft.com/office/drawing/2016/5/12/chartex" xmlns:cx7="http://schemas.microsoft.com/office/drawing/2016/5/13/chartex" xmlns:cx8="http://schemas.microsoft.com/office/drawing/2016/5/14/chartex" xmlns:mc="http://schemas.openxmlformats.org/markup-compatibility/2006" xmlns:aink="http://schemas.microsoft.com/office/drawing/2016/ink" xmlns:am3d="http://schemas.microsoft.com/office/drawing/2017/model3d" xmlns:o="urn:schemas-microsoft-com:office:office" xmlns:r="http://schemas.openxmlformats.org/officeDocument/2006/relationships" xmlns:m="http://schemas.openxmlformats.org/officeDocument/2006/math" xmlns:v="urn:schemas-microsoft-com:vml" xmlns:wp14="http://schemas.microsoft.com/office/word/2010/wordprocessingDrawing" xmlns:wp="http://schemas.openxmlformats.org/drawingml/2006/wordprocessingDrawing" xmlns:w10="urn:schemas-microsoft-com:office:word" xmlns:w="http://schemas.openxmlformats.org/wordprocessingml/2006/main" xmlns:w14="http://schemas.microsoft.com/office/word/2010/wordml" xmlns:w15="http://schemas.microsoft.com/office/word/2012/wordml" xmlns:w16cex="http://schemas.microsoft.com/office/word/2018/wordml/cex" xmlns:w16cid="http://schemas.microsoft.com/office/word/2016/wordml/cid" xmlns:w16="http://schemas.microsoft.com/office/word/2018/wordml" xmlns:w16sdtdh="http://schemas.microsoft.com/office/word/2020/wordml/sdtdatahash" xmlns:w16se="http://schemas.microsoft.com/office/word/2015/wordml/symex" xmlns:wpg="http://schemas.microsoft.com/office/word/2010/wordprocessingGroup" xmlns:wpi="http://schemas.microsoft.com/office/word/2010/wordprocessingInk" xmlns:wne="http://schemas.microsoft.com/office/word/2006/wordml" xmlns:wps="http://schemas.microsoft.com/office/word/2010/wordprocessingShape" mc:Ignorable="w14 w15 w16se w16cid w16 w16cex w16sdtdh wp14">
   <w:footnote w:type="separator" w:id="-1">
     <w:p>
       <w:r>
@@ -3825,7 +3716,7 @@
 </file>
 
 <file path=word/numbering.xml><?xml version="1.0" encoding="utf-8"?>
-<w:numbering xmlns:wpc="http://schemas.microsoft.com/office/word/2010/wordprocessingCanvas" xmlns:cx="http://schemas.microsoft.com/office/drawing/2014/chartex" xmlns:mc="http://schemas.openxmlformats.org/markup-compatibility/2006" xmlns:o="urn:schemas-microsoft-com:office:office" xmlns:r="http://schemas.openxmlformats.org/officeDocument/2006/relationships" xmlns:m="http://schemas.openxmlformats.org/officeDocument/2006/math" xmlns:v="urn:schemas-microsoft-com:vml" xmlns:wp14="http://schemas.microsoft.com/office/word/2010/wordprocessingDrawing" xmlns:wp="http://schemas.openxmlformats.org/drawingml/2006/wordprocessingDrawing" xmlns:w10="urn:schemas-microsoft-com:office:word" xmlns:w="http://schemas.openxmlformats.org/wordprocessingml/2006/main" xmlns:w14="http://schemas.microsoft.com/office/word/2010/wordml" xmlns:w15="http://schemas.microsoft.com/office/word/2012/wordml" xmlns:w16se="http://schemas.microsoft.com/office/word/2015/wordml/symex" xmlns:wpg="http://schemas.microsoft.com/office/word/2010/wordprocessingGroup" xmlns:wpi="http://schemas.microsoft.com/office/word/2010/wordprocessingInk" xmlns:wne="http://schemas.microsoft.com/office/word/2006/wordml" xmlns:wps="http://schemas.microsoft.com/office/word/2010/wordprocessingShape" mc:Ignorable="w14 w15 w16se wp14">
+<w:numbering xmlns:wpc="http://schemas.microsoft.com/office/word/2010/wordprocessingCanvas" xmlns:cx="http://schemas.microsoft.com/office/drawing/2014/chartex" xmlns:cx1="http://schemas.microsoft.com/office/drawing/2015/9/8/chartex" xmlns:cx2="http://schemas.microsoft.com/office/drawing/2015/10/21/chartex" xmlns:cx3="http://schemas.microsoft.com/office/drawing/2016/5/9/chartex" xmlns:cx4="http://schemas.microsoft.com/office/drawing/2016/5/10/chartex" xmlns:cx5="http://schemas.microsoft.com/office/drawing/2016/5/11/chartex" xmlns:cx6="http://schemas.microsoft.com/office/drawing/2016/5/12/chartex" xmlns:cx7="http://schemas.microsoft.com/office/drawing/2016/5/13/chartex" xmlns:cx8="http://schemas.microsoft.com/office/drawing/2016/5/14/chartex" xmlns:mc="http://schemas.openxmlformats.org/markup-compatibility/2006" xmlns:aink="http://schemas.microsoft.com/office/drawing/2016/ink" xmlns:am3d="http://schemas.microsoft.com/office/drawing/2017/model3d" xmlns:o="urn:schemas-microsoft-com:office:office" xmlns:r="http://schemas.openxmlformats.org/officeDocument/2006/relationships" xmlns:m="http://schemas.openxmlformats.org/officeDocument/2006/math" xmlns:v="urn:schemas-microsoft-com:vml" xmlns:wp14="http://schemas.microsoft.com/office/word/2010/wordprocessingDrawing" xmlns:wp="http://schemas.openxmlformats.org/drawingml/2006/wordprocessingDrawing" xmlns:w10="urn:schemas-microsoft-com:office:word" xmlns:w="http://schemas.openxmlformats.org/wordprocessingml/2006/main" xmlns:w14="http://schemas.microsoft.com/office/word/2010/wordml" xmlns:w15="http://schemas.microsoft.com/office/word/2012/wordml" xmlns:w16cex="http://schemas.microsoft.com/office/word/2018/wordml/cex" xmlns:w16cid="http://schemas.microsoft.com/office/word/2016/wordml/cid" xmlns:w16="http://schemas.microsoft.com/office/word/2018/wordml" xmlns:w16sdtdh="http://schemas.microsoft.com/office/word/2020/wordml/sdtdatahash" xmlns:w16se="http://schemas.microsoft.com/office/word/2015/wordml/symex" xmlns:wpg="http://schemas.microsoft.com/office/word/2010/wordprocessingGroup" xmlns:wpi="http://schemas.microsoft.com/office/word/2010/wordprocessingInk" xmlns:wne="http://schemas.microsoft.com/office/word/2006/wordml" xmlns:wps="http://schemas.microsoft.com/office/word/2010/wordprocessingShape" mc:Ignorable="w14 w15 w16se w16cid w16 w16cex w16sdtdh wp14">
   <w:abstractNum w:abstractNumId="0" w15:restartNumberingAfterBreak="0">
     <w:nsid w:val="00000001"/>
     <w:multiLevelType w:val="hybridMultilevel"/>
@@ -6842,7 +6733,7 @@
 </file>
 
 <file path=word/styles.xml><?xml version="1.0" encoding="utf-8"?>
-<w:styles xmlns:mc="http://schemas.openxmlformats.org/markup-compatibility/2006" xmlns:r="http://schemas.openxmlformats.org/officeDocument/2006/relationships" xmlns:w="http://schemas.openxmlformats.org/wordprocessingml/2006/main" xmlns:w14="http://schemas.microsoft.com/office/word/2010/wordml" xmlns:w15="http://schemas.microsoft.com/office/word/2012/wordml" xmlns:w16se="http://schemas.microsoft.com/office/word/2015/wordml/symex" mc:Ignorable="w14 w15 w16se">
+<w:styles xmlns:mc="http://schemas.openxmlformats.org/markup-compatibility/2006" xmlns:r="http://schemas.openxmlformats.org/officeDocument/2006/relationships" xmlns:w="http://schemas.openxmlformats.org/wordprocessingml/2006/main" xmlns:w14="http://schemas.microsoft.com/office/word/2010/wordml" xmlns:w15="http://schemas.microsoft.com/office/word/2012/wordml" xmlns:w16cex="http://schemas.microsoft.com/office/word/2018/wordml/cex" xmlns:w16cid="http://schemas.microsoft.com/office/word/2016/wordml/cid" xmlns:w16="http://schemas.microsoft.com/office/word/2018/wordml" xmlns:w16sdtdh="http://schemas.microsoft.com/office/word/2020/wordml/sdtdatahash" xmlns:w16se="http://schemas.microsoft.com/office/word/2015/wordml/symex" mc:Ignorable="w14 w15 w16se w16cid w16 w16cex w16sdtdh">
   <w:docDefaults>
     <w:rPrDefault>
       <w:rPr>
@@ -6852,7 +6743,7 @@
     </w:rPrDefault>
     <w:pPrDefault/>
   </w:docDefaults>
-  <w:latentStyles w:defLockedState="0" w:defUIPriority="0" w:defSemiHidden="0" w:defUnhideWhenUsed="0" w:defQFormat="0" w:count="371">
+  <w:latentStyles w:defLockedState="0" w:defUIPriority="0" w:defSemiHidden="0" w:defUnhideWhenUsed="0" w:defQFormat="0" w:count="376">
     <w:lsdException w:name="Normal" w:qFormat="1"/>
     <w:lsdException w:name="heading 1" w:qFormat="1"/>
     <w:lsdException w:name="heading 2" w:semiHidden="1" w:unhideWhenUsed="1" w:qFormat="1"/>
@@ -7217,6 +7108,11 @@
     <w:lsdException w:name="List Table 5 Dark Accent 6" w:uiPriority="50"/>
     <w:lsdException w:name="List Table 6 Colorful Accent 6" w:uiPriority="51"/>
     <w:lsdException w:name="List Table 7 Colorful Accent 6" w:uiPriority="52"/>
+    <w:lsdException w:name="Mention" w:semiHidden="1" w:uiPriority="99" w:unhideWhenUsed="1"/>
+    <w:lsdException w:name="Smart Hyperlink" w:semiHidden="1" w:uiPriority="99" w:unhideWhenUsed="1"/>
+    <w:lsdException w:name="Hashtag" w:semiHidden="1" w:uiPriority="99" w:unhideWhenUsed="1"/>
+    <w:lsdException w:name="Unresolved Mention" w:semiHidden="1" w:uiPriority="99" w:unhideWhenUsed="1"/>
+    <w:lsdException w:name="Smart Link" w:semiHidden="1" w:uiPriority="99" w:unhideWhenUsed="1"/>
   </w:latentStyles>
   <w:style w:type="paragraph" w:default="1" w:styleId="a">
     <w:name w:val="Normal"/>

</xml_diff>